<commit_message>
Removed genre and like references
</commit_message>
<xml_diff>
--- a/BookVault_Technical_Report.docx
+++ b/BookVault_Technical_Report.docx
@@ -356,6 +356,14 @@
     </w:p>
     <w:p>
       <w:pPr>
+        <w:spacing w:after="160" w:line="276" w:lineRule="auto"/>
+      </w:pPr>
+      <w:r>
+        <w:t>Initial drafts included book genres and user likes stored within the database, however these were abandoned due to issues with the dataset: the original dataset used included genres but had no user metadata, an essential part of the project.</w:t>
+      </w:r>
+    </w:p>
+    <w:p>
+      <w:pPr>
         <w:pStyle w:val="Heading1"/>
       </w:pPr>
       <w:r>
@@ -407,6 +415,7 @@
         <w:spacing w:after="160" w:line="276" w:lineRule="auto"/>
       </w:pPr>
       <w:r>
+        <w:lastRenderedPageBreak/>
         <w:t xml:space="preserve">Claude (Anthropic) was used throughout the development process via the claude.ai interface. </w:t>
       </w:r>
       <w:r>
@@ -421,7 +430,6 @@
         <w:pStyle w:val="Heading2"/>
       </w:pPr>
       <w:r>
-        <w:lastRenderedPageBreak/>
         <w:t>7.2 How GenAI Was Used</w:t>
       </w:r>
     </w:p>
@@ -600,6 +608,7 @@
     </w:p>
     <w:p>
       <w:r>
+        <w:lastRenderedPageBreak/>
         <w:br w:type="page"/>
       </w:r>
     </w:p>

</xml_diff>

<commit_message>
Added link to hosted app
</commit_message>
<xml_diff>
--- a/BookVault_Technical_Report.docx
+++ b/BookVault_Technical_Report.docx
@@ -80,11 +80,6 @@
       <w:pPr>
         <w:spacing w:after="200"/>
         <w:jc w:val="center"/>
-        <w:rPr>
-          <w:color w:val="2E75B6"/>
-          <w:sz w:val="20"/>
-          <w:szCs w:val="20"/>
-        </w:rPr>
       </w:pPr>
       <w:r>
         <w:rPr>
@@ -109,6 +104,11 @@
       <w:pPr>
         <w:spacing w:after="200"/>
         <w:jc w:val="center"/>
+        <w:rPr>
+          <w:color w:val="2E75B6"/>
+          <w:sz w:val="20"/>
+          <w:szCs w:val="20"/>
+        </w:rPr>
       </w:pPr>
       <w:hyperlink r:id="rId8" w:history="1">
         <w:r>
@@ -117,11 +117,9 @@
             <w:sz w:val="20"/>
             <w:szCs w:val="20"/>
           </w:rPr>
-          <w:t>https://bookvault-api-wth1.onrender.com/</w:t>
+          <w:t>https://bookvault-api-wth1.onrender.com/docs</w:t>
         </w:r>
       </w:hyperlink>
-    </w:p>
-    <w:p>
       <w:r>
         <w:br w:type="page"/>
       </w:r>
@@ -854,12 +852,44 @@
         <w:t>: Y</w:t>
       </w:r>
       <w:r>
-        <w:t>our GET /users has dependencies=[Depends(verify_api_key)], but your custom_openapi() in main.py only applies the security scheme to non-GET methods. So when you click "Authorize" in Swagger, it only sends the X-API-Key header on POST/PUT/DELETE requests. For your protected GET, Swagger doesn't attach the key, so you get a 401.</w:t>
-      </w:r>
-    </w:p>
-    <w:p>
-      <w:r>
-        <w:t>The fix is in your custom_openapi function. You need to change it so it also applies security to GET operations that actually require it. The simplest approach: instead of only tagging non-GET methods, also tag any operation that has verify_api_key in its dependencies. But since the OpenAPI schema doesn't directly expose that, the easiest practical fix is to apply security globally and let unprotected endpoints just work without it (since auto_error=False means missing keys won't block public endpoints).</w:t>
+        <w:t xml:space="preserve">our GET /users </w:t>
+      </w:r>
+      <w:proofErr w:type="gramStart"/>
+      <w:r>
+        <w:t>has</w:t>
+      </w:r>
+      <w:proofErr w:type="gramEnd"/>
+      <w:r>
+        <w:t xml:space="preserve"> dependencies=[Depends(verify_api_key)], but your custom_openapi() in main.py only applies the security scheme to non-GET methods. </w:t>
+      </w:r>
+      <w:proofErr w:type="gramStart"/>
+      <w:r>
+        <w:t>So</w:t>
+      </w:r>
+      <w:proofErr w:type="gramEnd"/>
+      <w:r>
+        <w:t xml:space="preserve"> when you click "Authorize" in Swagger, it only sends the X-API-Key header on POST/PUT/DELETE requests. For your protected GET, Swagger doesn't attach the key, so you get a 401.</w:t>
+      </w:r>
+    </w:p>
+    <w:p>
+      <w:r>
+        <w:t xml:space="preserve">The fix is in your custom_openapi function. You need to change </w:t>
+      </w:r>
+      <w:proofErr w:type="gramStart"/>
+      <w:r>
+        <w:t>it</w:t>
+      </w:r>
+      <w:proofErr w:type="gramEnd"/>
+      <w:r>
+        <w:t xml:space="preserve"> so it also applies security to GET operations that </w:t>
+      </w:r>
+      <w:proofErr w:type="gramStart"/>
+      <w:r>
+        <w:t>actually require</w:t>
+      </w:r>
+      <w:proofErr w:type="gramEnd"/>
+      <w:r>
+        <w:t xml:space="preserve"> it. The simplest approach: instead of only tagging non-GET methods, also tag any operation that has verify_api_key in its dependencies. But since the OpenAPI schema doesn't directly expose that, the easiest practical fix is to apply security globally and let unprotected endpoints just work without it (since auto_error=False means missing keys won't block public endpoints).</w:t>
       </w:r>
     </w:p>
     <w:p/>

</xml_diff>